<commit_message>
Update RoE templates to v3.0
Refines the engagement paperwork into a single ~2-page document:
- Plain-language summary box (3 plain-English assurances) so a
  non-lawyer client grasps and signs it faster.
- Per-asset 'Client initials' column in the scope table — strong
  per-asset proof of authorization.
- Authorization merged into the signature block (§5) with a
  'I confirm I am authorized' checkbox at the point of signing;
  no separate authorization letter to chase.
- RoE version number stamped on the document.

Load-bearing controls unchanged: passive-first rules with the precise
minimal-verification carve-out, third-party assets excluded by default,
30-day purge + delete-on-request, liability floor of BDT 10,000,
immediate revocation. README updated for the combined-document flow.

Co-Authored-By: Claude Fable 5 <noreply@anthropic.com>
Claude-Session: https://claude.ai/code/session_01V6XK23ZKmYtCovRte9a73E
</commit_message>
<xml_diff>
--- a/legal/Cindrasec_RoE_Authorization.docx
+++ b/legal/Cindrasec_RoE_Authorization.docx
@@ -12,7 +12,7 @@
           <w:b/>
           <w:i w:val="0"/>
           <w:color w:val="C2361A"/>
-          <w:sz w:val="40"/>
+          <w:sz w:val="38"/>
         </w:rPr>
         <w:t>CINDRASEC</w:t>
       </w:r>
@@ -29,12 +29,12 @@
           <w:color w:val="1F252D"/>
           <w:sz w:val="24"/>
         </w:rPr>
-        <w:t>Authorization Letter &amp; Rules of Engagement</w:t>
+        <w:t>Rules of Engagement &amp; Authorization to Test</w:t>
       </w:r>
     </w:p>
     <w:p>
       <w:pPr>
-        <w:spacing w:after="40"/>
+        <w:spacing w:after="120"/>
         <w:jc w:val="center"/>
       </w:pPr>
       <w:r>
@@ -42,37 +42,9 @@
           <w:b w:val="0"/>
           <w:i/>
           <w:color w:val="555B63"/>
-          <w:sz w:val="20"/>
-        </w:rPr>
-        <w:t>No signature, no scan.  ·  স্বাক্ষর ছাড়া কোনো স্ক্যান নয়।</w:t>
-      </w:r>
-    </w:p>
-    <w:p>
-      <w:pPr>
-        <w:spacing w:after="40"/>
-        <w:jc w:val="center"/>
-      </w:pPr>
-      <w:r>
-        <w:rPr>
-          <w:b w:val="0"/>
-          <w:i w:val="0"/>
-          <w:color w:val="555B63"/>
           <w:sz w:val="17"/>
         </w:rPr>
-        <w:t>এই একটি দলিলই নিচের কাজের একমাত্র বৈধ অনুমোদন — Cyber Security Ordinance 2025-সহ প্রযোজ্য আইনের অধীনে সকল অ্যাক্সেসকে "authorized access" হিসেবে প্রতিষ্ঠা করে।</w:t>
-      </w:r>
-    </w:p>
-    <w:p>
-      <w:pPr>
-        <w:spacing w:before="180" w:after="60"/>
-      </w:pPr>
-      <w:r>
-        <w:rPr>
-          <w:b/>
-          <w:color w:val="C2361A"/>
-          <w:sz w:val="24"/>
-        </w:rPr>
-        <w:t>1 · Engagement</w:t>
+        <w:t>security assessment agreement</w:t>
       </w:r>
     </w:p>
     <w:tbl>
@@ -82,36 +54,139 @@
         <w:tblLook w:firstColumn="1" w:firstRow="1" w:lastColumn="0" w:lastRow="0" w:noHBand="0" w:noVBand="1" w:val="04A0"/>
       </w:tblPr>
       <w:tblGrid>
-        <w:gridCol w:w="4968"/>
-        <w:gridCol w:w="4968"/>
+        <w:gridCol w:w="10080"/>
       </w:tblGrid>
       <w:tr>
         <w:tc>
           <w:tcPr>
-            <w:tcW w:type="dxa" w:w="2880"/>
+            <w:tcW w:type="dxa" w:w="10080"/>
+            <w:shd w:fill="FBF0EC"/>
           </w:tcPr>
           <w:p>
+            <w:pPr>
+              <w:spacing w:after="40"/>
+            </w:pPr>
+            <w:r/>
+            <w:r>
+              <w:rPr>
+                <w:b/>
+                <w:color w:val="C2361A"/>
+                <w:sz w:val="20"/>
+              </w:rPr>
+              <w:t xml:space="preserve">In one line:  </w:t>
+            </w:r>
+            <w:r>
+              <w:rPr>
+                <w:sz w:val="20"/>
+              </w:rPr>
+              <w:t>you authorize Cindrasec to safely test only the systems you list below, during the agreed window. Nothing is scanned until both parties sign.</w:t>
+            </w:r>
+          </w:p>
+          <w:p>
+            <w:pPr>
+              <w:spacing w:after="20"/>
+            </w:pPr>
+            <w:r>
+              <w:rPr>
+                <w:color w:val="1F252D"/>
+                <w:sz w:val="19"/>
+              </w:rPr>
+              <w:t>✓  Passive-first — your systems are not modified or taken offline.</w:t>
+            </w:r>
+          </w:p>
+          <w:p>
+            <w:pPr>
+              <w:spacing w:after="20"/>
+            </w:pPr>
+            <w:r>
+              <w:rPr>
+                <w:color w:val="1F252D"/>
+                <w:sz w:val="19"/>
+              </w:rPr>
+              <w:t>✓  Findings are confidential and go only to the person you name.</w:t>
+            </w:r>
+          </w:p>
+          <w:p>
+            <w:pPr>
+              <w:spacing w:after="20"/>
+            </w:pPr>
+            <w:r>
+              <w:rPr>
+                <w:color w:val="1F252D"/>
+                <w:sz w:val="19"/>
+              </w:rPr>
+              <w:t>✓  You can revoke this permission in writing at any time — testing stops at once.</w:t>
+            </w:r>
+          </w:p>
+          <w:p>
+            <w:r>
+              <w:rPr>
+                <w:i/>
+                <w:color w:val="555B63"/>
+                <w:sz w:val="18"/>
+              </w:rPr>
+              <w:t>স্বাক্ষর ছাড়া কোনো স্ক্যান নয়। অনুমতি লিখিতভাবে যেকোনো সময় প্রত্যাহারযোগ্য — প্রত্যাহারেই টেস্টিং বন্ধ।</w:t>
+            </w:r>
+          </w:p>
+        </w:tc>
+      </w:tr>
+    </w:tbl>
+    <w:p>
+      <w:pPr>
+        <w:spacing w:before="160" w:after="60"/>
+      </w:pPr>
+      <w:r>
+        <w:rPr>
+          <w:b/>
+          <w:color w:val="C2361A"/>
+          <w:sz w:val="23"/>
+        </w:rPr>
+        <w:t>1.  Engagement</w:t>
+      </w:r>
+    </w:p>
+    <w:tbl>
+      <w:tblPr>
+        <w:tblStyle w:val="TableGrid"/>
+        <w:tblW w:type="auto" w:w="0"/>
+        <w:tblLook w:firstColumn="1" w:firstRow="1" w:lastColumn="0" w:lastRow="0" w:noHBand="0" w:noVBand="1" w:val="04A0"/>
+      </w:tblPr>
+      <w:tblGrid>
+        <w:gridCol w:w="5040"/>
+        <w:gridCol w:w="5040"/>
+      </w:tblGrid>
+      <w:tr>
+        <w:tc>
+          <w:tcPr>
+            <w:tcW w:type="dxa" w:w="2664"/>
+          </w:tcPr>
+          <w:p>
+            <w:pPr>
+              <w:spacing w:after="20"/>
+            </w:pPr>
             <w:r/>
             <w:r>
               <w:rPr>
                 <w:b/>
                 <w:sz w:val="19"/>
               </w:rPr>
-              <w:t>Reference no.</w:t>
+              <w:t>Reference</w:t>
             </w:r>
           </w:p>
         </w:tc>
         <w:tc>
           <w:tcPr>
-            <w:tcW w:type="dxa" w:w="7056"/>
+            <w:tcW w:type="dxa" w:w="7416"/>
           </w:tcPr>
           <w:p>
+            <w:pPr>
+              <w:spacing w:after="20"/>
+            </w:pPr>
             <w:r/>
             <w:r>
               <w:rPr>
                 <w:sz w:val="19"/>
               </w:rPr>
-              <w:t>CS-AUTH-[YYYY-MM-NNN]</w:t>
+              <w:t>CS-AUTH-[YYYY-MM-NNN]          RoE version 3.0</w:t>
             </w:r>
           </w:p>
         </w:tc>
@@ -119,24 +194,30 @@
       <w:tr>
         <w:tc>
           <w:tcPr>
-            <w:tcW w:type="dxa" w:w="2880"/>
+            <w:tcW w:type="dxa" w:w="2664"/>
           </w:tcPr>
           <w:p>
+            <w:pPr>
+              <w:spacing w:after="20"/>
+            </w:pPr>
             <w:r/>
             <w:r>
               <w:rPr>
                 <w:b/>
                 <w:sz w:val="19"/>
               </w:rPr>
-              <w:t>Client</w:t>
+              <w:t>Client (company / person)</w:t>
             </w:r>
           </w:p>
         </w:tc>
         <w:tc>
           <w:tcPr>
-            <w:tcW w:type="dxa" w:w="7056"/>
+            <w:tcW w:type="dxa" w:w="7416"/>
           </w:tcPr>
           <w:p>
+            <w:pPr>
+              <w:spacing w:after="20"/>
+            </w:pPr>
             <w:r/>
             <w:r>
               <w:rPr>
@@ -150,9 +231,12 @@
       <w:tr>
         <w:tc>
           <w:tcPr>
-            <w:tcW w:type="dxa" w:w="2880"/>
+            <w:tcW w:type="dxa" w:w="2664"/>
           </w:tcPr>
           <w:p>
+            <w:pPr>
+              <w:spacing w:after="20"/>
+            </w:pPr>
             <w:r/>
             <w:r>
               <w:rPr>
@@ -165,15 +249,18 @@
         </w:tc>
         <w:tc>
           <w:tcPr>
-            <w:tcW w:type="dxa" w:w="7056"/>
+            <w:tcW w:type="dxa" w:w="7416"/>
           </w:tcPr>
           <w:p>
+            <w:pPr>
+              <w:spacing w:after="20"/>
+            </w:pPr>
             <w:r/>
             <w:r>
               <w:rPr>
                 <w:sz w:val="19"/>
               </w:rPr>
-              <w:t>________________  /  ________________  (Client-কে bind করার ক্ষমতাসম্পন্ন)</w:t>
+              <w:t>Name ________________   Title ________________</w:t>
             </w:r>
           </w:p>
         </w:tc>
@@ -181,9 +268,12 @@
       <w:tr>
         <w:tc>
           <w:tcPr>
-            <w:tcW w:type="dxa" w:w="2880"/>
+            <w:tcW w:type="dxa" w:w="2664"/>
           </w:tcPr>
           <w:p>
+            <w:pPr>
+              <w:spacing w:after="20"/>
+            </w:pPr>
             <w:r/>
             <w:r>
               <w:rPr>
@@ -196,15 +286,18 @@
         </w:tc>
         <w:tc>
           <w:tcPr>
-            <w:tcW w:type="dxa" w:w="7056"/>
+            <w:tcW w:type="dxa" w:w="7416"/>
           </w:tcPr>
           <w:p>
+            <w:pPr>
+              <w:spacing w:after="20"/>
+            </w:pPr>
             <w:r/>
             <w:r>
               <w:rPr>
                 <w:sz w:val="19"/>
               </w:rPr>
-              <w:t>Email: ________________   Phone: ________________</w:t>
+              <w:t>Email ________________   Phone ________________</w:t>
             </w:r>
           </w:p>
         </w:tc>
@@ -212,30 +305,36 @@
       <w:tr>
         <w:tc>
           <w:tcPr>
-            <w:tcW w:type="dxa" w:w="2880"/>
+            <w:tcW w:type="dxa" w:w="2664"/>
           </w:tcPr>
           <w:p>
+            <w:pPr>
+              <w:spacing w:after="20"/>
+            </w:pPr>
             <w:r/>
             <w:r>
               <w:rPr>
                 <w:b/>
                 <w:sz w:val="19"/>
               </w:rPr>
-              <w:t>Send findings to</w:t>
+              <w:t>Send findings only to</w:t>
             </w:r>
           </w:p>
         </w:tc>
         <w:tc>
           <w:tcPr>
-            <w:tcW w:type="dxa" w:w="7056"/>
+            <w:tcW w:type="dxa" w:w="7416"/>
           </w:tcPr>
           <w:p>
+            <w:pPr>
+              <w:spacing w:after="20"/>
+            </w:pPr>
             <w:r/>
             <w:r>
               <w:rPr>
                 <w:sz w:val="19"/>
               </w:rPr>
-              <w:t>________________  /  ________________  (findings শুধু এই ব্যক্তির কাছে যাবে)</w:t>
+              <w:t>Name ________________   Email ________________</w:t>
             </w:r>
           </w:p>
         </w:tc>
@@ -243,9 +342,12 @@
       <w:tr>
         <w:tc>
           <w:tcPr>
-            <w:tcW w:type="dxa" w:w="2880"/>
+            <w:tcW w:type="dxa" w:w="2664"/>
           </w:tcPr>
           <w:p>
+            <w:pPr>
+              <w:spacing w:after="20"/>
+            </w:pPr>
             <w:r/>
             <w:r>
               <w:rPr>
@@ -258,15 +360,18 @@
         </w:tc>
         <w:tc>
           <w:tcPr>
-            <w:tcW w:type="dxa" w:w="7056"/>
+            <w:tcW w:type="dxa" w:w="7416"/>
           </w:tcPr>
           <w:p>
+            <w:pPr>
+              <w:spacing w:after="20"/>
+            </w:pPr>
             <w:r/>
             <w:r>
               <w:rPr>
                 <w:sz w:val="19"/>
               </w:rPr>
-              <w:t>☐ Free Pilot  ☐ Snapshot  ☐ Watch  ☐ AI/LLM Assessment  ☐ Other: ______</w:t>
+              <w:t>☐ Free Pilot   ☐ Snapshot   ☐ Watch   ☐ AI/LLM   ☐ Other ______</w:t>
             </w:r>
           </w:p>
         </w:tc>
@@ -274,30 +379,36 @@
       <w:tr>
         <w:tc>
           <w:tcPr>
-            <w:tcW w:type="dxa" w:w="2880"/>
+            <w:tcW w:type="dxa" w:w="2664"/>
           </w:tcPr>
           <w:p>
+            <w:pPr>
+              <w:spacing w:after="20"/>
+            </w:pPr>
             <w:r/>
             <w:r>
               <w:rPr>
                 <w:b/>
                 <w:sz w:val="19"/>
               </w:rPr>
-              <w:t>Window</w:t>
+              <w:t>Testing window</w:t>
             </w:r>
           </w:p>
         </w:tc>
         <w:tc>
           <w:tcPr>
-            <w:tcW w:type="dxa" w:w="7056"/>
+            <w:tcW w:type="dxa" w:w="7416"/>
           </w:tcPr>
           <w:p>
+            <w:pPr>
+              <w:spacing w:after="20"/>
+            </w:pPr>
             <w:r/>
             <w:r>
               <w:rPr>
                 <w:sz w:val="19"/>
               </w:rPr>
-              <w:t>__________  →  __________  (date, time, timezone)   ☐ Ongoing (Watch)</w:t>
+              <w:t>________  →  ________ (date · time · timezone)   ☐ Ongoing (Watch)</w:t>
             </w:r>
           </w:p>
         </w:tc>
@@ -305,30 +416,36 @@
       <w:tr>
         <w:tc>
           <w:tcPr>
-            <w:tcW w:type="dxa" w:w="2880"/>
+            <w:tcW w:type="dxa" w:w="2664"/>
           </w:tcPr>
           <w:p>
+            <w:pPr>
+              <w:spacing w:after="20"/>
+            </w:pPr>
             <w:r/>
             <w:r>
               <w:rPr>
                 <w:b/>
                 <w:sz w:val="19"/>
               </w:rPr>
-              <w:t>Testing source IP(s)</w:t>
+              <w:t>Cindrasec source IP(s)</w:t>
             </w:r>
           </w:p>
         </w:tc>
         <w:tc>
           <w:tcPr>
-            <w:tcW w:type="dxa" w:w="7056"/>
+            <w:tcW w:type="dxa" w:w="7416"/>
           </w:tcPr>
           <w:p>
+            <w:pPr>
+              <w:spacing w:after="20"/>
+            </w:pPr>
             <w:r/>
             <w:r>
               <w:rPr>
                 <w:sz w:val="19"/>
               </w:rPr>
-              <w:t>________________________  (Client allowlisting-এর জন্য)</w:t>
+              <w:t>________________________  (for your allowlisting)</w:t>
             </w:r>
           </w:p>
         </w:tc>
@@ -336,9 +453,12 @@
       <w:tr>
         <w:tc>
           <w:tcPr>
-            <w:tcW w:type="dxa" w:w="2880"/>
+            <w:tcW w:type="dxa" w:w="2664"/>
           </w:tcPr>
           <w:p>
+            <w:pPr>
+              <w:spacing w:after="20"/>
+            </w:pPr>
             <w:r/>
             <w:r>
               <w:rPr>
@@ -351,15 +471,18 @@
         </w:tc>
         <w:tc>
           <w:tcPr>
-            <w:tcW w:type="dxa" w:w="7056"/>
+            <w:tcW w:type="dxa" w:w="7416"/>
           </w:tcPr>
           <w:p>
+            <w:pPr>
+              <w:spacing w:after="20"/>
+            </w:pPr>
             <w:r/>
             <w:r>
               <w:rPr>
                 <w:sz w:val="19"/>
               </w:rPr>
-              <w:t>Cindrasec: [phone/email]   ·   Client: ________________</w:t>
+              <w:t>Cindrasec [phone/email] ________   ·   Client ________</w:t>
             </w:r>
           </w:p>
         </w:tc>
@@ -367,91 +490,15 @@
     </w:tbl>
     <w:p>
       <w:pPr>
-        <w:spacing w:before="180" w:after="60"/>
+        <w:spacing w:before="160" w:after="60"/>
       </w:pPr>
       <w:r>
         <w:rPr>
           <w:b/>
           <w:color w:val="C2361A"/>
-          <w:sz w:val="24"/>
+          <w:sz w:val="23"/>
         </w:rPr>
-        <w:t>2 · Authorization</w:t>
-      </w:r>
-    </w:p>
-    <w:p>
-      <w:pPr>
-        <w:spacing w:after="60"/>
-      </w:pPr>
-      <w:r>
-        <w:rPr>
-          <w:b w:val="0"/>
-          <w:i w:val="0"/>
-          <w:sz w:val="20"/>
-        </w:rPr>
-        <w:t>Client, উপরের signatory-এর মাধ্যমে, Md. Azmol Haque Rony — independent security researcher, "Cindrasec" নামে কর্মরত — কে §3-এর scope ও সময়সীমার মধ্যে security assessment করার লিখিত অনুমতি দিচ্ছে এবং নিশ্চিত করছে যে:</w:t>
-      </w:r>
-    </w:p>
-    <w:p>
-      <w:pPr>
-        <w:pStyle w:val="ListBullet"/>
-        <w:spacing w:after="20"/>
-      </w:pPr>
-      <w:r>
-        <w:rPr>
-          <w:sz w:val="19"/>
-        </w:rPr>
-        <w:t>signatory-র Client-কে আইনগতভাবে bind করার ক্ষমতা আছে;</w:t>
-      </w:r>
-    </w:p>
-    <w:p>
-      <w:pPr>
-        <w:pStyle w:val="ListBullet"/>
-        <w:spacing w:after="20"/>
-      </w:pPr>
-      <w:r>
-        <w:rPr>
-          <w:sz w:val="19"/>
-        </w:rPr>
-        <w:t>তালিকাভুক্ত প্রতিটি asset-এর Client আইনসঙ্গত মালিক/নিয়ন্ত্রক — তৃতীয় পক্ষের অনুমতি লাগে না, বা লাগলে Client তা সংগ্রহ করেছে;</w:t>
-      </w:r>
-    </w:p>
-    <w:p>
-      <w:pPr>
-        <w:pStyle w:val="ListBullet"/>
-        <w:spacing w:after="20"/>
-      </w:pPr>
-      <w:r>
-        <w:rPr>
-          <w:sz w:val="19"/>
-        </w:rPr>
-        <w:t>Client-এর নিজস্ব backup ও change-control আছে।</w:t>
-      </w:r>
-    </w:p>
-    <w:p>
-      <w:pPr>
-        <w:spacing w:after="60"/>
-      </w:pPr>
-      <w:r>
-        <w:rPr>
-          <w:b w:val="0"/>
-          <w:i/>
-          <w:color w:val="555B63"/>
-          <w:sz w:val="20"/>
-        </w:rPr>
-        <w:t>এই অনুমতি লিখিত নোটিশে যেকোনো সময় তাৎক্ষণিকভাবে প্রত্যাহারযোগ্য; প্রত্যাহারের সঙ্গে সঙ্গে সব টেস্টিং বন্ধ হবে।  (Revocable in writing at any time; all testing stops immediately on revocation.)</w:t>
-      </w:r>
-    </w:p>
-    <w:p>
-      <w:pPr>
-        <w:spacing w:before="180" w:after="60"/>
-      </w:pPr>
-      <w:r>
-        <w:rPr>
-          <w:b/>
-          <w:color w:val="C2361A"/>
-          <w:sz w:val="24"/>
-        </w:rPr>
-        <w:t>3 · Scope</w:t>
+        <w:t>2.  Scope — the only systems that may be tested</w:t>
       </w:r>
     </w:p>
     <w:tbl>
@@ -461,16 +508,21 @@
         <w:tblLook w:firstColumn="1" w:firstRow="1" w:lastColumn="0" w:lastRow="0" w:noHBand="0" w:noVBand="1" w:val="04A0"/>
       </w:tblPr>
       <w:tblGrid>
-        <w:gridCol w:w="3312"/>
-        <w:gridCol w:w="3312"/>
-        <w:gridCol w:w="3312"/>
+        <w:gridCol w:w="2520"/>
+        <w:gridCol w:w="2520"/>
+        <w:gridCol w:w="2520"/>
+        <w:gridCol w:w="2520"/>
       </w:tblGrid>
       <w:tr>
         <w:tc>
           <w:tcPr>
-            <w:tcW w:type="dxa" w:w="576"/>
+            <w:tcW w:type="dxa" w:w="504"/>
+            <w:shd w:fill="F1F1F1"/>
           </w:tcPr>
           <w:p>
+            <w:pPr>
+              <w:spacing w:after="20"/>
+            </w:pPr>
             <w:r/>
             <w:r>
               <w:rPr>
@@ -483,9 +535,13 @@
         </w:tc>
         <w:tc>
           <w:tcPr>
-            <w:tcW w:type="dxa" w:w="7056"/>
+            <w:tcW w:type="dxa" w:w="5976"/>
+            <w:shd w:fill="F1F1F1"/>
           </w:tcPr>
           <w:p>
+            <w:pPr>
+              <w:spacing w:after="20"/>
+            </w:pPr>
             <w:r/>
             <w:r>
               <w:rPr>
@@ -498,9 +554,13 @@
         </w:tc>
         <w:tc>
           <w:tcPr>
-            <w:tcW w:type="dxa" w:w="2304"/>
+            <w:tcW w:type="dxa" w:w="1872"/>
+            <w:shd w:fill="F1F1F1"/>
           </w:tcPr>
           <w:p>
+            <w:pPr>
+              <w:spacing w:after="20"/>
+            </w:pPr>
             <w:r/>
             <w:r>
               <w:rPr>
@@ -511,13 +571,35 @@
             </w:r>
           </w:p>
         </w:tc>
+        <w:tc>
+          <w:tcPr>
+            <w:tcW w:type="dxa" w:w="1728"/>
+            <w:shd w:fill="F1F1F1"/>
+          </w:tcPr>
+          <w:p>
+            <w:pPr>
+              <w:spacing w:after="20"/>
+            </w:pPr>
+            <w:r/>
+            <w:r>
+              <w:rPr>
+                <w:b/>
+                <w:sz w:val="19"/>
+              </w:rPr>
+              <w:t>Client initials</w:t>
+            </w:r>
+          </w:p>
+        </w:tc>
       </w:tr>
       <w:tr>
         <w:tc>
           <w:tcPr>
-            <w:tcW w:type="dxa" w:w="576"/>
+            <w:tcW w:type="dxa" w:w="504"/>
           </w:tcPr>
           <w:p>
+            <w:pPr>
+              <w:spacing w:after="20"/>
+            </w:pPr>
             <w:r/>
             <w:r>
               <w:rPr>
@@ -529,9 +611,12 @@
         </w:tc>
         <w:tc>
           <w:tcPr>
-            <w:tcW w:type="dxa" w:w="7056"/>
+            <w:tcW w:type="dxa" w:w="5976"/>
           </w:tcPr>
           <w:p>
+            <w:pPr>
+              <w:spacing w:after="20"/>
+            </w:pPr>
             <w:r/>
             <w:r>
               <w:rPr>
@@ -542,9 +627,28 @@
         </w:tc>
         <w:tc>
           <w:tcPr>
-            <w:tcW w:type="dxa" w:w="2304"/>
+            <w:tcW w:type="dxa" w:w="1872"/>
           </w:tcPr>
           <w:p>
+            <w:pPr>
+              <w:spacing w:after="20"/>
+            </w:pPr>
+            <w:r/>
+            <w:r>
+              <w:rPr>
+                <w:sz w:val="19"/>
+              </w:rPr>
+            </w:r>
+          </w:p>
+        </w:tc>
+        <w:tc>
+          <w:tcPr>
+            <w:tcW w:type="dxa" w:w="1728"/>
+          </w:tcPr>
+          <w:p>
+            <w:pPr>
+              <w:spacing w:after="20"/>
+            </w:pPr>
             <w:r/>
             <w:r>
               <w:rPr>
@@ -557,9 +661,12 @@
       <w:tr>
         <w:tc>
           <w:tcPr>
-            <w:tcW w:type="dxa" w:w="576"/>
+            <w:tcW w:type="dxa" w:w="504"/>
           </w:tcPr>
           <w:p>
+            <w:pPr>
+              <w:spacing w:after="20"/>
+            </w:pPr>
             <w:r/>
             <w:r>
               <w:rPr>
@@ -571,9 +678,12 @@
         </w:tc>
         <w:tc>
           <w:tcPr>
-            <w:tcW w:type="dxa" w:w="7056"/>
+            <w:tcW w:type="dxa" w:w="5976"/>
           </w:tcPr>
           <w:p>
+            <w:pPr>
+              <w:spacing w:after="20"/>
+            </w:pPr>
             <w:r/>
             <w:r>
               <w:rPr>
@@ -584,9 +694,28 @@
         </w:tc>
         <w:tc>
           <w:tcPr>
-            <w:tcW w:type="dxa" w:w="2304"/>
+            <w:tcW w:type="dxa" w:w="1872"/>
           </w:tcPr>
           <w:p>
+            <w:pPr>
+              <w:spacing w:after="20"/>
+            </w:pPr>
+            <w:r/>
+            <w:r>
+              <w:rPr>
+                <w:sz w:val="19"/>
+              </w:rPr>
+            </w:r>
+          </w:p>
+        </w:tc>
+        <w:tc>
+          <w:tcPr>
+            <w:tcW w:type="dxa" w:w="1728"/>
+          </w:tcPr>
+          <w:p>
+            <w:pPr>
+              <w:spacing w:after="20"/>
+            </w:pPr>
             <w:r/>
             <w:r>
               <w:rPr>
@@ -599,9 +728,12 @@
       <w:tr>
         <w:tc>
           <w:tcPr>
-            <w:tcW w:type="dxa" w:w="576"/>
+            <w:tcW w:type="dxa" w:w="504"/>
           </w:tcPr>
           <w:p>
+            <w:pPr>
+              <w:spacing w:after="20"/>
+            </w:pPr>
             <w:r/>
             <w:r>
               <w:rPr>
@@ -613,9 +745,12 @@
         </w:tc>
         <w:tc>
           <w:tcPr>
-            <w:tcW w:type="dxa" w:w="7056"/>
+            <w:tcW w:type="dxa" w:w="5976"/>
           </w:tcPr>
           <w:p>
+            <w:pPr>
+              <w:spacing w:after="20"/>
+            </w:pPr>
             <w:r/>
             <w:r>
               <w:rPr>
@@ -626,9 +761,28 @@
         </w:tc>
         <w:tc>
           <w:tcPr>
-            <w:tcW w:type="dxa" w:w="2304"/>
+            <w:tcW w:type="dxa" w:w="1872"/>
           </w:tcPr>
           <w:p>
+            <w:pPr>
+              <w:spacing w:after="20"/>
+            </w:pPr>
+            <w:r/>
+            <w:r>
+              <w:rPr>
+                <w:sz w:val="19"/>
+              </w:rPr>
+            </w:r>
+          </w:p>
+        </w:tc>
+        <w:tc>
+          <w:tcPr>
+            <w:tcW w:type="dxa" w:w="1728"/>
+          </w:tcPr>
+          <w:p>
+            <w:pPr>
+              <w:spacing w:after="20"/>
+            </w:pPr>
             <w:r/>
             <w:r>
               <w:rPr>
@@ -647,22 +801,22 @@
         <w:rPr>
           <w:b w:val="0"/>
           <w:i w:val="0"/>
-          <w:sz w:val="20"/>
+          <w:sz w:val="19"/>
         </w:rPr>
-        <w:t>Out of scope (default): তালিকার বাইরের যেকোনো asset · তৃতীয়-পক্ষের infrastructure (shared hosting, SaaS, payment processor, CDN) · physical / social-engineering / phishing · DoS বা destructive action। Discovery-তে পাওয়া নতুন asset রিপোর্ট হবে, কিন্তু লিখিতভাবে (উভয় contact-এর email) যোগ না করা পর্যন্ত টেস্ট হবে না। মৌখিক পরিবর্তন নয়।</w:t>
+        <w:t>Out of scope (default): anything not listed above · third-party infrastructure (shared hosting, SaaS, payment processors, CDNs) · physical, social-engineering &amp; phishing tests · any denial-of-service or destructive action. New assets found while testing are reported, not tested, until added here in writing (email from both contacts is enough). No verbal changes.</w:t>
       </w:r>
     </w:p>
     <w:p>
       <w:pPr>
-        <w:spacing w:before="180" w:after="60"/>
+        <w:spacing w:before="160" w:after="60"/>
       </w:pPr>
       <w:r>
         <w:rPr>
           <w:b/>
           <w:color w:val="C2361A"/>
-          <w:sz w:val="24"/>
+          <w:sz w:val="23"/>
         </w:rPr>
-        <w:t>4 · Rules</w:t>
+        <w:t>3.  Rules</w:t>
       </w:r>
     </w:p>
     <w:tbl>
@@ -672,37 +826,45 @@
         <w:tblLook w:firstColumn="1" w:firstRow="1" w:lastColumn="0" w:lastRow="0" w:noHBand="0" w:noVBand="1" w:val="04A0"/>
       </w:tblPr>
       <w:tblGrid>
-        <w:gridCol w:w="4968"/>
-        <w:gridCol w:w="4968"/>
+        <w:gridCol w:w="5040"/>
+        <w:gridCol w:w="5040"/>
       </w:tblGrid>
       <w:tr>
         <w:tc>
           <w:tcPr>
             <w:tcW w:type="dxa" w:w="4968"/>
+            <w:shd w:fill="F1F1F1"/>
           </w:tcPr>
           <w:p>
+            <w:pPr>
+              <w:spacing w:after="20"/>
+            </w:pPr>
             <w:r/>
             <w:r>
               <w:rPr>
                 <w:b/>
                 <w:sz w:val="19"/>
               </w:rPr>
-              <w:t>✅ Authorized</w:t>
+              <w:t>Authorized</w:t>
             </w:r>
           </w:p>
         </w:tc>
         <w:tc>
           <w:tcPr>
-            <w:tcW w:type="dxa" w:w="4968"/>
+            <w:tcW w:type="dxa" w:w="5112"/>
+            <w:shd w:fill="F1F1F1"/>
           </w:tcPr>
           <w:p>
+            <w:pPr>
+              <w:spacing w:after="20"/>
+            </w:pPr>
             <w:r/>
             <w:r>
               <w:rPr>
                 <w:b/>
                 <w:sz w:val="19"/>
               </w:rPr>
-              <w:t>🚫 Prohibited (আলাদা লিখিত অনুমতি ছাড়া)</w:t>
+              <w:t>Not permitted without separate written consent</w:t>
             </w:r>
           </w:p>
         </w:tc>
@@ -713,20 +875,26 @@
             <w:tcW w:type="dxa" w:w="4968"/>
           </w:tcPr>
           <w:p>
+            <w:pPr>
+              <w:spacing w:after="20"/>
+            </w:pPr>
             <w:r/>
             <w:r>
               <w:rPr>
                 <w:sz w:val="19"/>
               </w:rPr>
-              <w:t>Passive recon ও discovery — DNS, certificate transparency, OSINT</w:t>
+              <w:t>Passive recon &amp; discovery (DNS, certificate transparency, OSINT)</w:t>
             </w:r>
           </w:p>
         </w:tc>
         <w:tc>
           <w:tcPr>
-            <w:tcW w:type="dxa" w:w="4968"/>
+            <w:tcW w:type="dxa" w:w="5112"/>
           </w:tcPr>
           <w:p>
+            <w:pPr>
+              <w:spacing w:after="20"/>
+            </w:pPr>
             <w:r/>
             <w:r>
               <w:rPr>
@@ -743,26 +911,32 @@
             <w:tcW w:type="dxa" w:w="4968"/>
           </w:tcPr>
           <w:p>
+            <w:pPr>
+              <w:spacing w:after="20"/>
+            </w:pPr>
             <w:r/>
             <w:r>
               <w:rPr>
                 <w:sz w:val="19"/>
               </w:rPr>
-              <w:t>Exposed secret / credential / misconfiguration detection</w:t>
+              <w:t>Detecting exposed secrets, credentials &amp; misconfigurations</w:t>
             </w:r>
           </w:p>
         </w:tc>
         <w:tc>
           <w:tcPr>
-            <w:tcW w:type="dxa" w:w="4968"/>
+            <w:tcW w:type="dxa" w:w="5112"/>
           </w:tcPr>
           <w:p>
+            <w:pPr>
+              <w:spacing w:after="20"/>
+            </w:pPr>
             <w:r/>
             <w:r>
               <w:rPr>
                 <w:sz w:val="19"/>
               </w:rPr>
-              <w:t>Data exfiltration (minimum proof-এর বাইরে); Client ডেটা পরিবর্তন/মুছে ফেলা</w:t>
+              <w:t>Data exfiltration beyond a minimal proof; changing or deleting your data</w:t>
             </w:r>
           </w:p>
         </w:tc>
@@ -773,26 +947,32 @@
             <w:tcW w:type="dxa" w:w="4968"/>
           </w:tcPr>
           <w:p>
+            <w:pPr>
+              <w:spacing w:after="20"/>
+            </w:pPr>
             <w:r/>
             <w:r>
               <w:rPr>
                 <w:sz w:val="19"/>
               </w:rPr>
-              <w:t>Minimal verification — পাওয়া credential live কিনা নিশ্চিত করতে issuing provider-এ একটিমাত্র minimum-necessary metadata call, এর বেশি নয়</w:t>
+              <w:t>Minimal verification: one minimum-necessary metadata call to a provider to confirm a found credential is live — nothing more</w:t>
             </w:r>
           </w:p>
         </w:tc>
         <w:tc>
           <w:tcPr>
-            <w:tcW w:type="dxa" w:w="4968"/>
+            <w:tcW w:type="dxa" w:w="5112"/>
           </w:tcPr>
           <w:p>
+            <w:pPr>
+              <w:spacing w:after="20"/>
+            </w:pPr>
             <w:r/>
             <w:r>
               <w:rPr>
                 <w:sz w:val="19"/>
               </w:rPr>
-              <w:t>Denial-of-service, load/stress testing, rate-limit ভাঙা</w:t>
+              <w:t>Denial-of-service, load / stress testing, breaking rate limits</w:t>
             </w:r>
           </w:p>
         </w:tc>
@@ -803,26 +983,32 @@
             <w:tcW w:type="dxa" w:w="4968"/>
           </w:tcPr>
           <w:p>
+            <w:pPr>
+              <w:spacing w:after="20"/>
+            </w:pPr>
             <w:r/>
             <w:r>
               <w:rPr>
                 <w:sz w:val="19"/>
               </w:rPr>
-              <w:t>Throttled scanning (≈ ২ request/second/host)</w:t>
+              <w:t>Throttled automated scanning (≈ 2 requests/second per host)</w:t>
             </w:r>
           </w:p>
         </w:tc>
         <w:tc>
           <w:tcPr>
-            <w:tcW w:type="dxa" w:w="4968"/>
+            <w:tcW w:type="dxa" w:w="5112"/>
           </w:tcPr>
           <w:p>
+            <w:pPr>
+              <w:spacing w:after="20"/>
+            </w:pPr>
             <w:r/>
             <w:r>
               <w:rPr>
                 <w:sz w:val="19"/>
               </w:rPr>
-              <w:t>প্রকৃত user account takeover বা real-user data access</w:t>
+              <w:t>Taking over real user accounts or accessing real user data</w:t>
             </w:r>
           </w:p>
         </w:tc>
@@ -833,26 +1019,32 @@
             <w:tcW w:type="dxa" w:w="4968"/>
           </w:tcPr>
           <w:p>
+            <w:pPr>
+              <w:spacing w:after="20"/>
+            </w:pPr>
             <w:r/>
             <w:r>
               <w:rPr>
                 <w:sz w:val="19"/>
               </w:rPr>
-              <w:t>AI/LLM package: তালিকাভুক্ত AI system-এ prompt-injection, jailbreak, data-leak, agent-abuse — শুধু test account দিয়ে</w:t>
+              <w:t>AI/LLM package: prompt-injection, jailbreak, data-leak &amp; agent-abuse tests on the listed AI systems, using test accounts only</w:t>
             </w:r>
           </w:p>
         </w:tc>
         <w:tc>
           <w:tcPr>
-            <w:tcW w:type="dxa" w:w="4968"/>
+            <w:tcW w:type="dxa" w:w="5112"/>
           </w:tcPr>
           <w:p>
+            <w:pPr>
+              <w:spacing w:after="20"/>
+            </w:pPr>
             <w:r/>
             <w:r>
               <w:rPr>
                 <w:sz w:val="19"/>
               </w:rPr>
-              <w:t>Physical access, social engineering, phishing; অন্য tenant বা model provider টেস্টিং</w:t>
+              <w:t>Physical access, social engineering, phishing; testing other tenants or the model provider</w:t>
             </w:r>
           </w:p>
         </w:tc>
@@ -860,15 +1052,15 @@
     </w:tbl>
     <w:p>
       <w:pPr>
-        <w:spacing w:before="180" w:after="60"/>
+        <w:spacing w:before="160" w:after="60"/>
       </w:pPr>
       <w:r>
         <w:rPr>
           <w:b/>
           <w:color w:val="C2361A"/>
-          <w:sz w:val="24"/>
+          <w:sz w:val="23"/>
         </w:rPr>
-        <w:t>5 · Terms</w:t>
+        <w:t>4.  Key terms</w:t>
       </w:r>
     </w:p>
     <w:tbl>
@@ -878,15 +1070,18 @@
         <w:tblLook w:firstColumn="1" w:firstRow="1" w:lastColumn="0" w:lastRow="0" w:noHBand="0" w:noVBand="1" w:val="04A0"/>
       </w:tblPr>
       <w:tblGrid>
-        <w:gridCol w:w="4968"/>
-        <w:gridCol w:w="4968"/>
+        <w:gridCol w:w="5040"/>
+        <w:gridCol w:w="5040"/>
       </w:tblGrid>
       <w:tr>
         <w:tc>
           <w:tcPr>
-            <w:tcW w:type="dxa" w:w="2016"/>
+            <w:tcW w:type="dxa" w:w="1944"/>
           </w:tcPr>
           <w:p>
+            <w:pPr>
+              <w:spacing w:after="20"/>
+            </w:pPr>
             <w:r/>
             <w:r>
               <w:rPr>
@@ -899,15 +1094,18 @@
         </w:tc>
         <w:tc>
           <w:tcPr>
-            <w:tcW w:type="dxa" w:w="7920"/>
+            <w:tcW w:type="dxa" w:w="8136"/>
           </w:tcPr>
           <w:p>
+            <w:pPr>
+              <w:spacing w:after="20"/>
+            </w:pPr>
             <w:r/>
             <w:r>
               <w:rPr>
                 <w:sz w:val="19"/>
               </w:rPr>
-              <w:t>Self-hosted infra-তে encrypted; রিপোর্টে credential redacted; raw data ডেলিভারির ৩০ দিন পর auto-purge — লিখিত অনুরোধে তার আগেই।</w:t>
+              <w:t>Encrypted on Cindrasec self-hosted infrastructure; credentials redacted in reports; raw data auto-deleted 30 days after delivery, or sooner on written request.</w:t>
             </w:r>
           </w:p>
         </w:tc>
@@ -915,9 +1113,12 @@
       <w:tr>
         <w:tc>
           <w:tcPr>
-            <w:tcW w:type="dxa" w:w="2016"/>
+            <w:tcW w:type="dxa" w:w="1944"/>
           </w:tcPr>
           <w:p>
+            <w:pPr>
+              <w:spacing w:after="20"/>
+            </w:pPr>
             <w:r/>
             <w:r>
               <w:rPr>
@@ -930,15 +1131,18 @@
         </w:tc>
         <w:tc>
           <w:tcPr>
-            <w:tcW w:type="dxa" w:w="7920"/>
+            <w:tcW w:type="dxa" w:w="8136"/>
           </w:tcPr>
           <w:p>
+            <w:pPr>
+              <w:spacing w:after="20"/>
+            </w:pPr>
             <w:r/>
             <w:r>
               <w:rPr>
                 <w:sz w:val="19"/>
               </w:rPr>
-              <w:t>Findings গোপন; শুধু §1-এ নির্ধারিত recipient-এর কাছে যাবে।</w:t>
+              <w:t>Findings are confidential and go only to the recipient named in §1.</w:t>
             </w:r>
           </w:p>
         </w:tc>
@@ -946,9 +1150,12 @@
       <w:tr>
         <w:tc>
           <w:tcPr>
-            <w:tcW w:type="dxa" w:w="2016"/>
+            <w:tcW w:type="dxa" w:w="1944"/>
           </w:tcPr>
           <w:p>
+            <w:pPr>
+              <w:spacing w:after="20"/>
+            </w:pPr>
             <w:r/>
             <w:r>
               <w:rPr>
@@ -961,15 +1168,18 @@
         </w:tc>
         <w:tc>
           <w:tcPr>
-            <w:tcW w:type="dxa" w:w="7920"/>
+            <w:tcW w:type="dxa" w:w="8136"/>
           </w:tcPr>
           <w:p>
+            <w:pPr>
+              <w:spacing w:after="20"/>
+            </w:pPr>
             <w:r/>
             <w:r>
               <w:rPr>
                 <w:sz w:val="19"/>
               </w:rPr>
-              <w:t>Scan শেষে ৩–৫ কর্মদিবসে final report (finding শূন্য হলেও coverage + confidence statement-সহ); Critical/High নিশ্চিত হওয়ার ২৪ ঘণ্টায় phone + email-এ escalate।</w:t>
+              <w:t>Final report within 3–5 working days of scan completion — with a coverage &amp; confidence statement even if nothing is found. Critical/High findings escalated by phone + email within 24 hours.</w:t>
             </w:r>
           </w:p>
         </w:tc>
@@ -977,9 +1187,12 @@
       <w:tr>
         <w:tc>
           <w:tcPr>
-            <w:tcW w:type="dxa" w:w="2016"/>
+            <w:tcW w:type="dxa" w:w="1944"/>
           </w:tcPr>
           <w:p>
+            <w:pPr>
+              <w:spacing w:after="20"/>
+            </w:pPr>
             <w:r/>
             <w:r>
               <w:rPr>
@@ -992,15 +1205,18 @@
         </w:tc>
         <w:tc>
           <w:tcPr>
-            <w:tcW w:type="dxa" w:w="7920"/>
+            <w:tcW w:type="dxa" w:w="8136"/>
           </w:tcPr>
           <w:p>
+            <w:pPr>
+              <w:spacing w:after="20"/>
+            </w:pPr>
             <w:r/>
             <w:r>
               <w:rPr>
                 <w:sz w:val="19"/>
               </w:rPr>
-              <w:t>Point-in-time assessment — সব vulnerability খুঁজে পাওয়ার guarantee নয়।</w:t>
+              <w:t>A point-in-time assessment — not a guarantee that every vulnerability is found.</w:t>
             </w:r>
           </w:p>
         </w:tc>
@@ -1008,9 +1224,12 @@
       <w:tr>
         <w:tc>
           <w:tcPr>
-            <w:tcW w:type="dxa" w:w="2016"/>
+            <w:tcW w:type="dxa" w:w="1944"/>
           </w:tcPr>
           <w:p>
+            <w:pPr>
+              <w:spacing w:after="20"/>
+            </w:pPr>
             <w:r/>
             <w:r>
               <w:rPr>
@@ -1023,15 +1242,18 @@
         </w:tc>
         <w:tc>
           <w:tcPr>
-            <w:tcW w:type="dxa" w:w="7920"/>
+            <w:tcW w:type="dxa" w:w="8136"/>
           </w:tcPr>
           <w:p>
+            <w:pPr>
+              <w:spacing w:after="20"/>
+            </w:pPr>
             <w:r/>
             <w:r>
               <w:rPr>
                 <w:sz w:val="19"/>
               </w:rPr>
-              <w:t>প্রদত্ত ফি বা ৳১০,০০০ — যেটি বেশি — তাতে সীমাবদ্ধ; indirect/consequential loss-এর দায় নেই; ভুল/মিথ্যা authorization তথ্যের দায় Client-এর।</w:t>
+              <w:t>Each party's total liability is capped at fees paid, or BDT 10,000, whichever is higher; no indirect or consequential loss. False authorization details (ownership, authority) are the Client's responsibility.</w:t>
             </w:r>
           </w:p>
         </w:tc>
@@ -1039,9 +1261,12 @@
       <w:tr>
         <w:tc>
           <w:tcPr>
-            <w:tcW w:type="dxa" w:w="2016"/>
+            <w:tcW w:type="dxa" w:w="1944"/>
           </w:tcPr>
           <w:p>
+            <w:pPr>
+              <w:spacing w:after="20"/>
+            </w:pPr>
             <w:r/>
             <w:r>
               <w:rPr>
@@ -1054,15 +1279,18 @@
         </w:tc>
         <w:tc>
           <w:tcPr>
-            <w:tcW w:type="dxa" w:w="7920"/>
+            <w:tcW w:type="dxa" w:w="8136"/>
           </w:tcPr>
           <w:p>
+            <w:pPr>
+              <w:spacing w:after="20"/>
+            </w:pPr>
             <w:r/>
             <w:r>
               <w:rPr>
                 <w:sz w:val="19"/>
               </w:rPr>
-              <w:t>৭ দিনের লিখিত নোটিশে বাতিলযোগ্য; সম্পন্ন কাজের ফি অ-ফেরতযোগ্য। Authorization প্রত্যাহার (§2) সবসময় তাৎক্ষণিক।</w:t>
+              <w:t>Either party may end this on 7 days' written notice; fees for completed work are non-refundable. Revoking authorization (§5) is always immediate.</w:t>
             </w:r>
           </w:p>
         </w:tc>
@@ -1070,9 +1298,12 @@
       <w:tr>
         <w:tc>
           <w:tcPr>
-            <w:tcW w:type="dxa" w:w="2016"/>
+            <w:tcW w:type="dxa" w:w="1944"/>
           </w:tcPr>
           <w:p>
+            <w:pPr>
+              <w:spacing w:after="20"/>
+            </w:pPr>
             <w:r/>
             <w:r>
               <w:rPr>
@@ -1085,15 +1316,18 @@
         </w:tc>
         <w:tc>
           <w:tcPr>
-            <w:tcW w:type="dxa" w:w="7920"/>
+            <w:tcW w:type="dxa" w:w="8136"/>
           </w:tcPr>
           <w:p>
+            <w:pPr>
+              <w:spacing w:after="20"/>
+            </w:pPr>
             <w:r/>
             <w:r>
               <w:rPr>
                 <w:sz w:val="19"/>
               </w:rPr>
-              <w:t>বাংলাদেশ; আন্তর্জাতিক ক্লায়েন্টের জন্য পৃথক arbitration clause।</w:t>
+              <w:t>Bangladesh. A separate arbitration clause is added for international clients.</w:t>
             </w:r>
           </w:p>
         </w:tc>
@@ -1101,28 +1335,15 @@
     </w:tbl>
     <w:p>
       <w:pPr>
-        <w:spacing w:before="180" w:after="60"/>
+        <w:spacing w:before="160" w:after="60"/>
       </w:pPr>
       <w:r>
         <w:rPr>
           <w:b/>
           <w:color w:val="C2361A"/>
-          <w:sz w:val="24"/>
+          <w:sz w:val="23"/>
         </w:rPr>
-        <w:t>6 · Case study (optional)</w:t>
-      </w:r>
-    </w:p>
-    <w:p>
-      <w:pPr>
-        <w:spacing w:after="40"/>
-      </w:pPr>
-      <w:r>
-        <w:rPr>
-          <w:b w:val="0"/>
-          <w:i w:val="0"/>
-          <w:sz w:val="20"/>
-        </w:rPr>
-        <w:t>☐ হ্যাঁ — fix নিশ্চিত হওয়ার পর Cindrasec একটি anonymized, redacted case study প্রকাশ করতে পারবে; প্রকাশের আগে Client চূড়ান্ত টেক্সট অনুমোদন করবে।</w:t>
+        <w:t>5.  Authorization &amp; signatures</w:t>
       </w:r>
     </w:p>
     <w:p>
@@ -1135,20 +1356,57 @@
           <w:i w:val="0"/>
           <w:sz w:val="20"/>
         </w:rPr>
-        <w:t>☐ না — কোনো case study নয়।  (টিক না দিলে = না।)</w:t>
+        <w:t>By signing, the Client authorizes Md. Azmol Haque Rony — independent security researcher, operating as "Cindrasec" — to perform the assessment above, and confirms that:</w:t>
       </w:r>
     </w:p>
     <w:p>
       <w:pPr>
-        <w:spacing w:before="180" w:after="60"/>
+        <w:pStyle w:val="ListBullet"/>
+        <w:spacing w:after="20"/>
       </w:pPr>
       <w:r>
         <w:rPr>
-          <w:b/>
-          <w:color w:val="C2361A"/>
-          <w:sz w:val="24"/>
+          <w:sz w:val="19"/>
         </w:rPr>
-        <w:t>7 · Signatures</w:t>
+        <w:t>the signatory has authority to bind the Client;</w:t>
+      </w:r>
+    </w:p>
+    <w:p>
+      <w:pPr>
+        <w:pStyle w:val="ListBullet"/>
+        <w:spacing w:after="20"/>
+      </w:pPr>
+      <w:r>
+        <w:rPr>
+          <w:sz w:val="19"/>
+        </w:rPr>
+        <w:t>the Client owns or lawfully controls every in-scope asset (no third-party permission is needed, or it has been obtained);</w:t>
+      </w:r>
+    </w:p>
+    <w:p>
+      <w:pPr>
+        <w:pStyle w:val="ListBullet"/>
+        <w:spacing w:after="20"/>
+      </w:pPr>
+      <w:r>
+        <w:rPr>
+          <w:sz w:val="19"/>
+        </w:rPr>
+        <w:t>the Client keeps its own backups and change control.</w:t>
+      </w:r>
+    </w:p>
+    <w:p>
+      <w:pPr>
+        <w:spacing w:after="80"/>
+      </w:pPr>
+      <w:r>
+        <w:rPr>
+          <w:b w:val="0"/>
+          <w:i/>
+          <w:color w:val="555B63"/>
+          <w:sz w:val="19"/>
+        </w:rPr>
+        <w:t>This authorization establishes authorized access under applicable law, including the Bangladesh Cyber Security Ordinance 2025, and is revocable in writing at any time — on revocation all testing stops immediately.</w:t>
       </w:r>
     </w:p>
     <w:tbl>
@@ -1158,15 +1416,19 @@
         <w:tblLook w:firstColumn="1" w:firstRow="1" w:lastColumn="0" w:lastRow="0" w:noHBand="0" w:noVBand="1" w:val="04A0"/>
       </w:tblPr>
       <w:tblGrid>
-        <w:gridCol w:w="4968"/>
-        <w:gridCol w:w="4968"/>
+        <w:gridCol w:w="5040"/>
+        <w:gridCol w:w="5040"/>
       </w:tblGrid>
       <w:tr>
         <w:tc>
           <w:tcPr>
-            <w:tcW w:type="dxa" w:w="4968"/>
+            <w:tcW w:type="dxa" w:w="5040"/>
+            <w:shd w:fill="F1F1F1"/>
           </w:tcPr>
           <w:p>
+            <w:pPr>
+              <w:spacing w:after="20"/>
+            </w:pPr>
             <w:r/>
             <w:r>
               <w:rPr>
@@ -1179,9 +1441,13 @@
         </w:tc>
         <w:tc>
           <w:tcPr>
-            <w:tcW w:type="dxa" w:w="4968"/>
+            <w:tcW w:type="dxa" w:w="5040"/>
+            <w:shd w:fill="F1F1F1"/>
           </w:tcPr>
           <w:p>
+            <w:pPr>
+              <w:spacing w:after="20"/>
+            </w:pPr>
             <w:r/>
             <w:r>
               <w:rPr>
@@ -1196,29 +1462,34 @@
       <w:tr>
         <w:tc>
           <w:tcPr>
-            <w:tcW w:type="dxa" w:w="4968"/>
+            <w:tcW w:type="dxa" w:w="5040"/>
           </w:tcPr>
           <w:p>
+            <w:pPr>
+              <w:spacing w:after="20"/>
+            </w:pPr>
             <w:r/>
             <w:r>
               <w:rPr>
                 <w:sz w:val="19"/>
               </w:rPr>
-              <w:t>Name: ____________________</w:t>
+              <w:t>☐ I confirm I am authorized to approve testing of the assets in §2.</w:t>
             </w:r>
           </w:p>
         </w:tc>
         <w:tc>
           <w:tcPr>
-            <w:tcW w:type="dxa" w:w="4968"/>
+            <w:tcW w:type="dxa" w:w="5040"/>
           </w:tcPr>
           <w:p>
+            <w:pPr>
+              <w:spacing w:after="20"/>
+            </w:pPr>
             <w:r/>
             <w:r>
               <w:rPr>
                 <w:sz w:val="19"/>
               </w:rPr>
-              <w:t>Name: Md. Azmol Haque Rony</w:t>
             </w:r>
           </w:p>
         </w:tc>
@@ -1226,29 +1497,35 @@
       <w:tr>
         <w:tc>
           <w:tcPr>
-            <w:tcW w:type="dxa" w:w="4968"/>
+            <w:tcW w:type="dxa" w:w="5040"/>
           </w:tcPr>
           <w:p>
+            <w:pPr>
+              <w:spacing w:after="20"/>
+            </w:pPr>
             <w:r/>
             <w:r>
               <w:rPr>
                 <w:sz w:val="19"/>
               </w:rPr>
-              <w:t>Title: ____________________</w:t>
+              <w:t>Name ____________________</w:t>
             </w:r>
           </w:p>
         </w:tc>
         <w:tc>
           <w:tcPr>
-            <w:tcW w:type="dxa" w:w="4968"/>
+            <w:tcW w:type="dxa" w:w="5040"/>
           </w:tcPr>
           <w:p>
+            <w:pPr>
+              <w:spacing w:after="20"/>
+            </w:pPr>
             <w:r/>
             <w:r>
               <w:rPr>
                 <w:sz w:val="19"/>
               </w:rPr>
-              <w:t>Title: Independent Security Researcher — Cindrasec</w:t>
+              <w:t>Name  Md. Azmol Haque Rony</w:t>
             </w:r>
           </w:p>
         </w:tc>
@@ -1256,29 +1533,35 @@
       <w:tr>
         <w:tc>
           <w:tcPr>
-            <w:tcW w:type="dxa" w:w="4968"/>
+            <w:tcW w:type="dxa" w:w="5040"/>
           </w:tcPr>
           <w:p>
+            <w:pPr>
+              <w:spacing w:after="20"/>
+            </w:pPr>
             <w:r/>
             <w:r>
               <w:rPr>
                 <w:sz w:val="19"/>
               </w:rPr>
-              <w:t>Signature: ________________</w:t>
+              <w:t>Title ____________________</w:t>
             </w:r>
           </w:p>
         </w:tc>
         <w:tc>
           <w:tcPr>
-            <w:tcW w:type="dxa" w:w="4968"/>
+            <w:tcW w:type="dxa" w:w="5040"/>
           </w:tcPr>
           <w:p>
+            <w:pPr>
+              <w:spacing w:after="20"/>
+            </w:pPr>
             <w:r/>
             <w:r>
               <w:rPr>
                 <w:sz w:val="19"/>
               </w:rPr>
-              <w:t>Signature: ________________</w:t>
+              <w:t>Title  Independent Security Researcher — Cindrasec</w:t>
             </w:r>
           </w:p>
         </w:tc>
@@ -1286,29 +1569,71 @@
       <w:tr>
         <w:tc>
           <w:tcPr>
-            <w:tcW w:type="dxa" w:w="4968"/>
+            <w:tcW w:type="dxa" w:w="5040"/>
           </w:tcPr>
           <w:p>
+            <w:pPr>
+              <w:spacing w:after="20"/>
+            </w:pPr>
             <w:r/>
             <w:r>
               <w:rPr>
                 <w:sz w:val="19"/>
               </w:rPr>
-              <w:t>Date: ____________</w:t>
+              <w:t>Signature ________________</w:t>
             </w:r>
           </w:p>
         </w:tc>
         <w:tc>
           <w:tcPr>
-            <w:tcW w:type="dxa" w:w="4968"/>
+            <w:tcW w:type="dxa" w:w="5040"/>
           </w:tcPr>
           <w:p>
+            <w:pPr>
+              <w:spacing w:after="20"/>
+            </w:pPr>
             <w:r/>
             <w:r>
               <w:rPr>
                 <w:sz w:val="19"/>
               </w:rPr>
-              <w:t>Date: ____________</w:t>
+              <w:t>Signature ________________</w:t>
+            </w:r>
+          </w:p>
+        </w:tc>
+      </w:tr>
+      <w:tr>
+        <w:tc>
+          <w:tcPr>
+            <w:tcW w:type="dxa" w:w="5040"/>
+          </w:tcPr>
+          <w:p>
+            <w:pPr>
+              <w:spacing w:after="20"/>
+            </w:pPr>
+            <w:r/>
+            <w:r>
+              <w:rPr>
+                <w:sz w:val="19"/>
+              </w:rPr>
+              <w:t>Date ____________</w:t>
+            </w:r>
+          </w:p>
+        </w:tc>
+        <w:tc>
+          <w:tcPr>
+            <w:tcW w:type="dxa" w:w="5040"/>
+          </w:tcPr>
+          <w:p>
+            <w:pPr>
+              <w:spacing w:after="20"/>
+            </w:pPr>
+            <w:r/>
+            <w:r>
+              <w:rPr>
+                <w:sz w:val="19"/>
+              </w:rPr>
+              <w:t>Date ____________</w:t>
             </w:r>
           </w:p>
         </w:tc>
@@ -1316,7 +1641,7 @@
     </w:tbl>
     <w:p>
       <w:pPr>
-        <w:spacing w:before="160"/>
+        <w:spacing w:before="120"/>
       </w:pPr>
       <w:r>
         <w:rPr>
@@ -1324,12 +1649,12 @@
           <w:color w:val="555B63"/>
           <w:sz w:val="17"/>
         </w:rPr>
-        <w:t>DRAFT — প্রথম paid engagement ও যেকোনো আন্তর্জাতিক ক্লায়েন্টের আগে আইনজীবী-রিভিউ করান। এটি আইনি পরামর্শ নয়।</w:t>
+        <w:t>Draft template — have a lawyer review before the first paid engagement, and always for international clients. Not legal advice.</w:t>
       </w:r>
     </w:p>
     <w:sectPr>
       <w:pgSz w:w="12240" w:h="15840"/>
-      <w:pgMar w:top="936" w:right="1152" w:bottom="936" w:left="1152" w:header="720" w:footer="720" w:gutter="0"/>
+      <w:pgMar w:top="864" w:right="1080" w:bottom="864" w:left="1080" w:header="720" w:footer="720" w:gutter="0"/>
       <w:cols w:space="720"/>
       <w:docGrid w:linePitch="360"/>
     </w:sectPr>

</xml_diff>